<commit_message>
docs: move filler labels out of voice collection
</commit_message>
<xml_diff>
--- a/docs/word/voice-fit-수집자-안내.docx
+++ b/docs/word/voice-fit-수집자-안내.docx
@@ -171,7 +171,7 @@
           <w:color w:val="0B2545"/>
           <w:sz w:val="22"/>
         </w:rPr>
-        <w:t>한 번 읽을 땐 목소리 상태 하나만 넣기. 예: 빠르게 말하는 샘플에 “음…” 넣거나 중간에 멈추는 식으로 섞지 않기.</w:t>
+        <w:t>한 번 읽을 땐 목소리 상태 하나만 담기. 예: 빠르게 말하는 샘플과 중간에 멈추는 샘플을 한 번에 섞지 않기.</w:t>
       </w:r>
     </w:p>
     <w:p>
@@ -606,7 +606,7 @@
         <w:pStyle w:val="Heading1"/>
       </w:pPr>
       <w:r>
-        <w:t>말버릇과 목소리</w:t>
+        <w:t>멈춤과 목소리</w:t>
       </w:r>
     </w:p>
     <w:tbl>
@@ -667,110 +667,6 @@
                 <w:sz w:val="21"/>
               </w:rPr>
               <w:t>안내</w:t>
-            </w:r>
-          </w:p>
-        </w:tc>
-      </w:tr>
-      <w:tr>
-        <w:tc>
-          <w:tcPr>
-            <w:tcW w:type="dxa" w:w="2700"/>
-            <w:tcMar>
-              <w:top w:w="80" w:type="dxa"/>
-              <w:start w:w="120" w:type="dxa"/>
-              <w:bottom w:w="80" w:type="dxa"/>
-              <w:end w:w="120" w:type="dxa"/>
-            </w:tcMar>
-            <w:vAlign w:val="center"/>
-          </w:tcPr>
-          <w:p>
-            <w:pPr>
-              <w:spacing w:after="0" w:line="276" w:lineRule="auto"/>
-            </w:pPr>
-            <w:r>
-              <w:rPr>
-                <w:rFonts w:ascii="AppleGothic" w:hAnsi="AppleGothic" w:eastAsia="AppleGothic"/>
-                <w:color w:val="0B2545"/>
-                <w:sz w:val="21"/>
-              </w:rPr>
-              <w:t>“음…” 넣기</w:t>
-            </w:r>
-          </w:p>
-        </w:tc>
-        <w:tc>
-          <w:tcPr>
-            <w:tcW w:type="dxa" w:w="6660"/>
-            <w:tcMar>
-              <w:top w:w="80" w:type="dxa"/>
-              <w:start w:w="120" w:type="dxa"/>
-              <w:bottom w:w="80" w:type="dxa"/>
-              <w:end w:w="120" w:type="dxa"/>
-            </w:tcMar>
-            <w:vAlign w:val="center"/>
-          </w:tcPr>
-          <w:p>
-            <w:pPr>
-              <w:spacing w:after="0" w:line="276" w:lineRule="auto"/>
-            </w:pPr>
-            <w:r>
-              <w:rPr>
-                <w:rFonts w:ascii="AppleGothic" w:hAnsi="AppleGothic" w:eastAsia="AppleGothic"/>
-                <w:color w:val="0B2545"/>
-                <w:sz w:val="21"/>
-              </w:rPr>
-              <w:t>문장 중간에 “음…” 또는 “어…” 한 번만 넣고 끝까지 읽기</w:t>
-            </w:r>
-          </w:p>
-        </w:tc>
-      </w:tr>
-      <w:tr>
-        <w:tc>
-          <w:tcPr>
-            <w:tcW w:type="dxa" w:w="2700"/>
-            <w:tcMar>
-              <w:top w:w="80" w:type="dxa"/>
-              <w:start w:w="120" w:type="dxa"/>
-              <w:bottom w:w="80" w:type="dxa"/>
-              <w:end w:w="120" w:type="dxa"/>
-            </w:tcMar>
-            <w:vAlign w:val="center"/>
-          </w:tcPr>
-          <w:p>
-            <w:pPr>
-              <w:spacing w:after="0" w:line="276" w:lineRule="auto"/>
-            </w:pPr>
-            <w:r>
-              <w:rPr>
-                <w:rFonts w:ascii="AppleGothic" w:hAnsi="AppleGothic" w:eastAsia="AppleGothic"/>
-                <w:color w:val="0B2545"/>
-                <w:sz w:val="21"/>
-              </w:rPr>
-              <w:t>다시 말하기</w:t>
-            </w:r>
-          </w:p>
-        </w:tc>
-        <w:tc>
-          <w:tcPr>
-            <w:tcW w:type="dxa" w:w="6660"/>
-            <w:tcMar>
-              <w:top w:w="80" w:type="dxa"/>
-              <w:start w:w="120" w:type="dxa"/>
-              <w:bottom w:w="80" w:type="dxa"/>
-              <w:end w:w="120" w:type="dxa"/>
-            </w:tcMar>
-            <w:vAlign w:val="center"/>
-          </w:tcPr>
-          <w:p>
-            <w:pPr>
-              <w:spacing w:after="0" w:line="276" w:lineRule="auto"/>
-            </w:pPr>
-            <w:r>
-              <w:rPr>
-                <w:rFonts w:ascii="AppleGothic" w:hAnsi="AppleGothic" w:eastAsia="AppleGothic"/>
-                <w:color w:val="0B2545"/>
-                <w:sz w:val="21"/>
-              </w:rPr>
-              <w:t>짧은 구절을 한 번 말한 뒤 그 구절부터 다시 말하며 이어 읽기</w:t>
             </w:r>
           </w:p>
         </w:tc>
@@ -954,7 +850,7 @@
               <a:graphicData uri="http://schemas.openxmlformats.org/drawingml/2006/picture">
                 <pic:pic>
                   <pic:nvPicPr>
-                    <pic:cNvPr id="0" name="03-speaking-patterns.png"/>
+                    <pic:cNvPr id="0" name="03-pauses-and-voice.png"/>
                     <pic:cNvPicPr/>
                   </pic:nvPicPr>
                   <pic:blipFill>
@@ -988,7 +884,7 @@
           <w:color w:val="6B7280"/>
           <w:sz w:val="18"/>
         </w:rPr>
-        <w:t>그림 3. Voice-Fit 말버릇과 목소리</w:t>
+        <w:t>그림 3. Voice-Fit 멈춤과 목소리</w:t>
       </w:r>
     </w:p>
     <w:p>
@@ -1037,7 +933,7 @@
           <w:color w:val="0B2545"/>
           <w:sz w:val="22"/>
         </w:rPr>
-        <w:t>2. 목소리 상태 8개 → 한 사람당 총 80개 녹음</w:t>
+        <w:t>2. 목소리 상태 6개 → 한 사람당 총 60개 녹음</w:t>
       </w:r>
     </w:p>
     <w:p>
@@ -1051,7 +947,7 @@
           <w:color w:val="0B2545"/>
           <w:sz w:val="22"/>
         </w:rPr>
-        <w:t>3. 한 사람 녹음 시간 약 15~20분</w:t>
+        <w:t>3. 한 사람 녹음 시간 약 10~15분</w:t>
       </w:r>
     </w:p>
     <w:p>
@@ -1065,7 +961,7 @@
           <w:color w:val="0B2545"/>
           <w:sz w:val="22"/>
         </w:rPr>
-        <w:t>4. 12명 녹음 → 상태마다 120개, 전체 960개</w:t>
+        <w:t>4. 12명 녹음 → 상태마다 120개, 전체 720개</w:t>
       </w:r>
     </w:p>
     <w:sectPr>

</xml_diff>